<commit_message>
add fuzzy search in home page
</commit_message>
<xml_diff>
--- a/resources/templates/1经济责任审计通知书.docx
+++ b/resources/templates/1经济责任审计通知书.docx
@@ -26,41 +26,71 @@
           <w:lang w:eastAsia="zh-CN"/>
         </w:rPr>
       </w:pPr>
+    </w:p>
+    <w:p>
+      <w:pPr>
+        <w:keepNext w:val="0"/>
+        <w:keepLines w:val="0"/>
+        <w:pageBreakBefore w:val="0"/>
+        <w:widowControl w:val="0"/>
+        <w:kinsoku/>
+        <w:wordWrap/>
+        <w:overflowPunct/>
+        <w:topLinePunct w:val="0"/>
+        <w:autoSpaceDE/>
+        <w:autoSpaceDN/>
+        <w:bidi w:val="0"/>
+        <w:adjustRightInd w:val="0"/>
+        <w:snapToGrid w:val="0"/>
+        <w:spacing w:line="560" w:lineRule="exact"/>
+        <w:jc w:val="center"/>
+        <w:textAlignment w:val="auto"/>
+        <w:rPr>
+          <w:rFonts w:hint="eastAsia" w:ascii="仿宋_GB2312" w:eastAsia="长城大标宋体"/>
+          <w:color w:val="FF0000"/>
+          <w:sz w:val="30"/>
+        </w:rPr>
+      </w:pPr>
       <w:bookmarkStart w:id="0" w:name="_GoBack"/>
       <w:bookmarkEnd w:id="0"/>
-    </w:p>
-    <w:p>
-      <w:pPr>
-        <w:keepNext w:val="0"/>
-        <w:keepLines w:val="0"/>
-        <w:pageBreakBefore w:val="0"/>
-        <w:widowControl w:val="0"/>
-        <w:kinsoku/>
-        <w:wordWrap/>
-        <w:overflowPunct/>
-        <w:topLinePunct w:val="0"/>
-        <w:autoSpaceDE/>
-        <w:autoSpaceDN/>
-        <w:bidi w:val="0"/>
-        <w:adjustRightInd w:val="0"/>
-        <w:snapToGrid w:val="0"/>
-        <w:spacing w:line="560" w:lineRule="exact"/>
-        <w:jc w:val="center"/>
-        <w:textAlignment w:val="auto"/>
-        <w:rPr>
-          <w:rFonts w:hint="default" w:ascii="Times New Roman" w:hAnsi="Times New Roman" w:eastAsia="仿宋_GB2312" w:cs="Times New Roman"/>
-          <w:color w:val="auto"/>
-          <w:sz w:val="28"/>
-        </w:rPr>
-      </w:pPr>
       <w:r>
         <w:rPr>
-          <w:rFonts w:hint="default" w:ascii="Times New Roman" w:hAnsi="Times New Roman" w:eastAsia="仿宋_GB2312" w:cs="Times New Roman"/>
-          <w:color w:val="auto"/>
-          <w:sz w:val="28"/>
-        </w:rPr>
-        <w:t>{auditCommitteeOffice}</w:t>
+          <w:rFonts w:hint="default" w:ascii="Times New Roman" w:hAnsi="Times New Roman" w:eastAsia="长城大标宋体" w:cs="Times New Roman"/>
+          <w:color w:val="FF0000"/>
+          <w:spacing w:val="30"/>
+          <w:sz w:val="40"/>
+          <w:lang w:eastAsia="zh-CN"/>
+        </w:rPr>
+        <w:t>{audit</w:t>
       </w:r>
+      <w:r>
+        <w:rPr>
+          <w:rFonts w:hint="eastAsia" w:eastAsia="长城大标宋体" w:cs="Times New Roman"/>
+          <w:color w:val="FF0000"/>
+          <w:spacing w:val="30"/>
+          <w:sz w:val="40"/>
+          <w:lang w:val="en-US" w:eastAsia="zh-CN"/>
+        </w:rPr>
+        <w:t>CommitteeOffice</w:t>
+      </w:r>
+      <w:r>
+        <w:rPr>
+          <w:rFonts w:hint="default" w:ascii="Times New Roman" w:hAnsi="Times New Roman" w:eastAsia="长城大标宋体" w:cs="Times New Roman"/>
+          <w:color w:val="FF0000"/>
+          <w:spacing w:val="30"/>
+          <w:sz w:val="40"/>
+          <w:lang w:eastAsia="zh-CN"/>
+        </w:rPr>
+        <w:t>}</w:t>
+      </w:r>
+    </w:p>
+    <w:p>
+      <w:pPr>
+        <w:pStyle w:val="2"/>
+        <w:rPr>
+          <w:rFonts w:hint="default"/>
+        </w:rPr>
+      </w:pPr>
     </w:p>
     <w:p>
       <w:pPr>

</xml_diff>